<commit_message>
add docusign + oth fixes
</commit_message>
<xml_diff>
--- a/rentacar/exword_samples/lease.docx
+++ b/rentacar/exword_samples/lease.docx
@@ -1411,7 +1411,15 @@
         <w:t xml:space="preserve">{{limit}} </w:t>
       </w:r>
       <w:r>
-        <w:t xml:space="preserve">miles per month and be charged $0.15 per extra mile if the Vehicle is driven over the allotted amount of miles. </w:t>
+        <w:t xml:space="preserve">miles per month and be charged $0.15 per extra mile if the Vehicle is driven over the allotted </w:t>
+      </w:r>
+      <w:proofErr w:type="gramStart"/>
+      <w:r>
+        <w:t>amount</w:t>
+      </w:r>
+      <w:proofErr w:type="gramEnd"/>
+      <w:r>
+        <w:t xml:space="preserve"> of miles. </w:t>
       </w:r>
     </w:p>
     <w:p>
@@ -1524,7 +1532,15 @@
         <w:t>with deductible no greater than $500.00 per claim</w:t>
       </w:r>
       <w:r>
-        <w:t xml:space="preserve">). Proof of insurance or the insurance card must be provided to the Lessor upon request. The Lessee is responsible for insuring the Vehicle based on its full value. Creek Chariot Corp will be named as the registered owner and as "Additional Insured" and loss payee in the insurance policy. </w:t>
+        <w:t xml:space="preserve">). Proof of insurance or the insurance card must be provided to the Lessor upon request. The Lessee is responsible for </w:t>
+      </w:r>
+      <w:proofErr w:type="gramStart"/>
+      <w:r>
+        <w:t>insuring</w:t>
+      </w:r>
+      <w:proofErr w:type="gramEnd"/>
+      <w:r>
+        <w:t xml:space="preserve"> the Vehicle based on its full value. Creek Chariot Corp will be named as the registered owner and as "Additional Insured" and loss payee in the insurance policy. </w:t>
       </w:r>
       <w:r>
         <w:rPr>
@@ -2379,7 +2395,29 @@
         <w:ind w:left="360"/>
       </w:pPr>
       <w:r>
-        <w:t xml:space="preserve">      _________________ </w:t>
+        <w:t xml:space="preserve">      __</w:t>
+      </w:r>
+      <w:r>
+        <w:rPr>
+          <w:color w:val="FFFFFF" w:themeColor="background1"/>
+          <w:u w:val="single" w:color="000000" w:themeColor="text1"/>
+        </w:rPr>
+        <w:t>{{signature</w:t>
+      </w:r>
+      <w:proofErr w:type="gramStart"/>
+      <w:r>
+        <w:rPr>
+          <w:color w:val="FFFFFF" w:themeColor="background1"/>
+          <w:u w:val="single" w:color="000000" w:themeColor="text1"/>
+        </w:rPr>
+        <w:t>}}</w:t>
+      </w:r>
+      <w:r>
+        <w:t>_</w:t>
+      </w:r>
+      <w:proofErr w:type="gramEnd"/>
+      <w:r>
+        <w:t xml:space="preserve">__ </w:t>
       </w:r>
     </w:p>
     <w:p>
@@ -2580,9 +2618,18 @@
       <w:pPr>
         <w:pStyle w:val="p"/>
         <w:keepNext/>
+        <w:rPr>
+          <w:lang w:val="ru-RU"/>
+        </w:rPr>
       </w:pPr>
       <w:r>
         <w:t xml:space="preserve">           _______________</w:t>
+      </w:r>
+      <w:r>
+        <w:rPr>
+          <w:lang w:val="ru-RU"/>
+        </w:rPr>
+        <w:t>__</w:t>
       </w:r>
     </w:p>
     <w:sectPr>

</xml_diff>